<commit_message>
chore: publish resource export and exam updates
</commit_message>
<xml_diff>
--- a/course-content/authoring/shared/homework-problems/2026/2026-final-exam-A.docx
+++ b/course-content/authoring/shared/homework-problems/2026/2026-final-exam-A.docx
@@ -3013,14 +3013,14 @@
         </w:rPr>
         <w:drawing>
           <wp:inline>
-            <wp:extent cx="5334000" cy="4365201"/>
+            <wp:extent cx="5334000" cy="3572335"/>
             <wp:effectExtent b="0" l="0" r="0" t="0"/>
-            <wp:docPr descr="图 2 根轨迹读图示意图" title="" id="17" name="Picture"/>
+            <wp:docPr descr="图 2 根轨迹读图示意图（20260623-160841）" title="" id="17" name="Picture"/>
             <a:graphic>
               <a:graphicData uri="http://schemas.openxmlformats.org/drawingml/2006/picture">
                 <pic:pic>
                   <pic:nvPicPr>
-                    <pic:cNvPr descr="assets/T3/T3-2-root-locus-reading.png" id="18" name="Picture"/>
+                    <pic:cNvPr descr="assets/T3/T3-2-root-locus-reading-20260623-160841.png" id="18" name="Picture"/>
                     <pic:cNvPicPr>
                       <a:picLocks noChangeArrowheads="1" noChangeAspect="1"/>
                     </pic:cNvPicPr>
@@ -3034,7 +3034,7 @@
                   <pic:spPr bwMode="auto">
                     <a:xfrm>
                       <a:off x="0" y="0"/>
-                      <a:ext cx="5334000" cy="4365201"/>
+                      <a:ext cx="5334000" cy="3572335"/>
                     </a:xfrm>
                     <a:prstGeom prst="rect">
                       <a:avLst/>
@@ -3085,7 +3085,7 @@
           <w:color w:val="000000"/>
           <w:sz w:val="21"/>
         </w:rPr>
-        <w:t xml:space="preserve">根轨迹读图示意图</w:t>
+        <w:t xml:space="preserve">根轨迹读图示意图（20260623-160841）</w:t>
       </w:r>
     </w:p>
     <w:p>
@@ -3174,7 +3174,60 @@
           <w:color w:val="000000"/>
           <w:sz w:val="24"/>
         </w:rPr>
-        <w:t xml:space="preserve">。教师给出的完整根轨迹主图采用“作图增益”</w:t>
+        <w:t xml:space="preserve">。根轨迹主图对应开环极点</w:t>
+      </w:r>
+      <w:r>
+        <w:rPr>
+          <w:rFonts w:ascii="Times New Roman" w:hAnsi="Times New Roman" w:eastAsia="SimSun"/>
+          <w:b w:val="0"/>
+          <w:color w:val="000000"/>
+          <w:sz w:val="24"/>
+        </w:rPr>
+        <w:t xml:space="preserve"> </w:t>
+      </w:r>
+      <m:oMath>
+        <m:r>
+          <m:t>0</m:t>
+        </m:r>
+        <m:r>
+          <m:rPr>
+            <m:sty m:val="p"/>
+          </m:rPr>
+          <m:t>,</m:t>
+        </m:r>
+        <m:r>
+          <m:rPr>
+            <m:sty m:val="p"/>
+          </m:rPr>
+          <m:t>−</m:t>
+        </m:r>
+        <m:r>
+          <m:t>2</m:t>
+        </m:r>
+        <m:r>
+          <m:rPr>
+            <m:sty m:val="p"/>
+          </m:rPr>
+          <m:t>,</m:t>
+        </m:r>
+        <m:r>
+          <m:rPr>
+            <m:sty m:val="p"/>
+          </m:rPr>
+          <m:t>−</m:t>
+        </m:r>
+        <m:r>
+          <m:t>6</m:t>
+        </m:r>
+      </m:oMath>
+      <w:r>
+        <w:rPr>
+          <w:rFonts w:hint="eastAsia" w:ascii="Times New Roman" w:hAnsi="Times New Roman" w:eastAsia="SimSun"/>
+          <w:b w:val="0"/>
+          <w:color w:val="000000"/>
+          <w:sz w:val="24"/>
+        </w:rPr>
+        <w:t xml:space="preserve">、无开环零点，采用“作图增益”</w:t>
       </w:r>
       <w:r>
         <w:rPr>
@@ -3268,7 +3321,16 @@
           <w:color w:val="000000"/>
           <w:sz w:val="24"/>
         </w:rPr>
-        <w:t xml:space="preserve"> 2。</w:t>
+        <w:t xml:space="preserve"> </w:t>
+      </w:r>
+      <w:r>
+        <w:rPr>
+          <w:rFonts w:hint="eastAsia" w:ascii="Times New Roman" w:hAnsi="Times New Roman" w:eastAsia="SimSun"/>
+          <w:b w:val="0"/>
+          <w:color w:val="000000"/>
+          <w:sz w:val="24"/>
+        </w:rPr>
+        <w:t xml:space="preserve">2，请依据图中标注完成读图、换算和趋势解释。</w:t>
       </w:r>
     </w:p>
     <w:p>
@@ -3284,15 +3346,12 @@
           <w:color w:val="000000"/>
           <w:sz w:val="24"/>
         </w:rPr>
-        <w:t xml:space="preserve">已知读图信息如下：</w:t>
-      </w:r>
-    </w:p>
-    <w:p>
-      <w:pPr>
-        <w:numPr>
-          <w:ilvl w:val="0"/>
-          <w:numId w:val="1001"/>
-        </w:numPr>
+        <w:t xml:space="preserve">请回答：</w:t>
+      </w:r>
+    </w:p>
+    <w:p>
+      <w:pPr>
+        <w:pStyle w:val="BodyText"/>
         <w:spacing w:line="240" w:lineRule="auto" w:before="0" w:after="80"/>
         <w:ind w:firstLine="480"/>
       </w:pPr>
@@ -3303,7 +3362,7 @@
           <w:color w:val="000000"/>
           <w:sz w:val="24"/>
         </w:rPr>
-        <w:t xml:space="preserve">当</w:t>
+        <w:t xml:space="preserve">（1）写出闭环稳定的</w:t>
       </w:r>
       <w:r>
         <w:rPr>
@@ -3327,15 +3386,6 @@
             </m:r>
           </m:sub>
         </m:sSub>
-        <m:r>
-          <m:rPr>
-            <m:sty m:val="p"/>
-          </m:rPr>
-          <m:t>=</m:t>
-        </m:r>
-        <m:r>
-          <m:t>0</m:t>
-        </m:r>
       </m:oMath>
       <w:r>
         <w:rPr>
@@ -3353,223 +3403,7 @@
           <w:color w:val="000000"/>
           <w:sz w:val="24"/>
         </w:rPr>
-        <w:t xml:space="preserve">时，闭环极点位于</w:t>
-      </w:r>
-      <w:r>
-        <w:rPr>
-          <w:rFonts w:ascii="Times New Roman" w:hAnsi="Times New Roman" w:eastAsia="SimSun"/>
-          <w:b w:val="0"/>
-          <w:color w:val="000000"/>
-          <w:sz w:val="24"/>
-        </w:rPr>
-        <w:t xml:space="preserve"> </w:t>
-      </w:r>
-      <m:oMath>
-        <m:r>
-          <m:t>s</m:t>
-        </m:r>
-        <m:r>
-          <m:rPr>
-            <m:sty m:val="p"/>
-          </m:rPr>
-          <m:t>=</m:t>
-        </m:r>
-        <m:r>
-          <m:t>0</m:t>
-        </m:r>
-        <m:r>
-          <m:rPr>
-            <m:sty m:val="p"/>
-          </m:rPr>
-          <m:t>,</m:t>
-        </m:r>
-        <m:r>
-          <m:rPr>
-            <m:sty m:val="p"/>
-          </m:rPr>
-          <m:t>−</m:t>
-        </m:r>
-        <m:r>
-          <m:t>2</m:t>
-        </m:r>
-        <m:r>
-          <m:rPr>
-            <m:sty m:val="p"/>
-          </m:rPr>
-          <m:t>,</m:t>
-        </m:r>
-        <m:r>
-          <m:rPr>
-            <m:sty m:val="p"/>
-          </m:rPr>
-          <m:t>−</m:t>
-        </m:r>
-        <m:r>
-          <m:t>6</m:t>
-        </m:r>
-      </m:oMath>
-      <w:r>
-        <w:rPr>
-          <w:rFonts w:ascii="Times New Roman" w:hAnsi="Times New Roman" w:eastAsia="SimSun"/>
-          <w:b w:val="0"/>
-          <w:color w:val="000000"/>
-          <w:sz w:val="24"/>
-        </w:rPr>
-        <w:t xml:space="preserve">。</w:t>
-      </w:r>
-    </w:p>
-    <w:p>
-      <w:pPr>
-        <w:numPr>
-          <w:ilvl w:val="0"/>
-          <w:numId w:val="1001"/>
-        </w:numPr>
-        <w:spacing w:line="240" w:lineRule="auto" w:before="0" w:after="80"/>
-        <w:ind w:firstLine="480"/>
-      </w:pPr>
-      <w:r>
-        <w:rPr>
-          <w:rFonts w:hint="eastAsia" w:ascii="Times New Roman" w:hAnsi="Times New Roman" w:eastAsia="SimSun"/>
-          <w:b w:val="0"/>
-          <w:color w:val="000000"/>
-          <w:sz w:val="24"/>
-        </w:rPr>
-        <w:t xml:space="preserve">从</w:t>
-      </w:r>
-      <w:r>
-        <w:rPr>
-          <w:rFonts w:ascii="Times New Roman" w:hAnsi="Times New Roman" w:eastAsia="SimSun"/>
-          <w:b w:val="0"/>
-          <w:color w:val="000000"/>
-          <w:sz w:val="24"/>
-        </w:rPr>
-        <w:t xml:space="preserve"> </w:t>
-      </w:r>
-      <m:oMath>
-        <m:r>
-          <m:t>s</m:t>
-        </m:r>
-        <m:r>
-          <m:rPr>
-            <m:sty m:val="p"/>
-          </m:rPr>
-          <m:t>=</m:t>
-        </m:r>
-        <m:r>
-          <m:t>0</m:t>
-        </m:r>
-      </m:oMath>
-      <w:r>
-        <w:rPr>
-          <w:rFonts w:ascii="Times New Roman" w:hAnsi="Times New Roman" w:eastAsia="SimSun"/>
-          <w:b w:val="0"/>
-          <w:color w:val="000000"/>
-          <w:sz w:val="24"/>
-        </w:rPr>
-        <w:t xml:space="preserve"> </w:t>
-      </w:r>
-      <w:r>
-        <w:rPr>
-          <w:rFonts w:hint="eastAsia" w:ascii="Times New Roman" w:hAnsi="Times New Roman" w:eastAsia="SimSun"/>
-          <w:b w:val="0"/>
-          <w:color w:val="000000"/>
-          <w:sz w:val="24"/>
-        </w:rPr>
-        <w:t xml:space="preserve">与</w:t>
-      </w:r>
-      <w:r>
-        <w:rPr>
-          <w:rFonts w:ascii="Times New Roman" w:hAnsi="Times New Roman" w:eastAsia="SimSun"/>
-          <w:b w:val="0"/>
-          <w:color w:val="000000"/>
-          <w:sz w:val="24"/>
-        </w:rPr>
-        <w:t xml:space="preserve"> </w:t>
-      </w:r>
-      <m:oMath>
-        <m:r>
-          <m:t>s</m:t>
-        </m:r>
-        <m:r>
-          <m:rPr>
-            <m:sty m:val="p"/>
-          </m:rPr>
-          <m:t>=</m:t>
-        </m:r>
-        <m:r>
-          <m:rPr>
-            <m:sty m:val="p"/>
-          </m:rPr>
-          <m:t>−</m:t>
-        </m:r>
-        <m:r>
-          <m:t>2</m:t>
-        </m:r>
-      </m:oMath>
-      <w:r>
-        <w:rPr>
-          <w:rFonts w:ascii="Times New Roman" w:hAnsi="Times New Roman" w:eastAsia="SimSun"/>
-          <w:b w:val="0"/>
-          <w:color w:val="000000"/>
-          <w:sz w:val="24"/>
-        </w:rPr>
-        <w:t xml:space="preserve"> </w:t>
-      </w:r>
-      <w:r>
-        <w:rPr>
-          <w:rFonts w:hint="eastAsia" w:ascii="Times New Roman" w:hAnsi="Times New Roman" w:eastAsia="SimSun"/>
-          <w:b w:val="0"/>
-          <w:color w:val="000000"/>
-          <w:sz w:val="24"/>
-        </w:rPr>
-        <w:t xml:space="preserve">出发的两条实轴分支相向移动，并在</w:t>
-      </w:r>
-      <w:r>
-        <w:rPr>
-          <w:rFonts w:ascii="Times New Roman" w:hAnsi="Times New Roman" w:eastAsia="SimSun"/>
-          <w:b w:val="0"/>
-          <w:color w:val="000000"/>
-          <w:sz w:val="24"/>
-        </w:rPr>
-        <w:t xml:space="preserve"> </w:t>
-      </w:r>
-      <m:oMath>
-        <m:r>
-          <m:t>s</m:t>
-        </m:r>
-        <m:r>
-          <m:rPr>
-            <m:sty m:val="p"/>
-          </m:rPr>
-          <m:t>≈</m:t>
-        </m:r>
-        <m:r>
-          <m:rPr>
-            <m:sty m:val="p"/>
-          </m:rPr>
-          <m:t>−</m:t>
-        </m:r>
-        <m:r>
-          <m:t>0.8</m:t>
-        </m:r>
-      </m:oMath>
-      <w:r>
-        <w:rPr>
-          <w:rFonts w:ascii="Times New Roman" w:hAnsi="Times New Roman" w:eastAsia="SimSun"/>
-          <w:b w:val="0"/>
-          <w:color w:val="000000"/>
-          <w:sz w:val="24"/>
-        </w:rPr>
-        <w:t xml:space="preserve"> </w:t>
-      </w:r>
-      <w:r>
-        <w:rPr>
-          <w:rFonts w:hint="eastAsia" w:ascii="Times New Roman" w:hAnsi="Times New Roman" w:eastAsia="SimSun"/>
-          <w:b w:val="0"/>
-          <w:color w:val="000000"/>
-          <w:sz w:val="24"/>
-        </w:rPr>
-        <w:t xml:space="preserve">处分离，此时</w:t>
+        <w:t xml:space="preserve">取值窗口，并换算为实际控制器增益</w:t>
       </w:r>
       <w:r>
         <w:rPr>
@@ -3589,19 +3423,10 @@
           </m:e>
           <m:sub>
             <m:r>
-              <m:t>r</m:t>
+              <m:t>c</m:t>
             </m:r>
           </m:sub>
         </m:sSub>
-        <m:r>
-          <m:rPr>
-            <m:sty m:val="p"/>
-          </m:rPr>
-          <m:t>≈</m:t>
-        </m:r>
-        <m:r>
-          <m:t>1.6</m:t>
-        </m:r>
       </m:oMath>
       <w:r>
         <w:rPr>
@@ -3610,15 +3435,21 @@
           <w:color w:val="000000"/>
           <w:sz w:val="24"/>
         </w:rPr>
-        <w:t xml:space="preserve">。</w:t>
-      </w:r>
-    </w:p>
-    <w:p>
-      <w:pPr>
-        <w:numPr>
-          <w:ilvl w:val="0"/>
-          <w:numId w:val="1001"/>
-        </w:numPr>
+        <w:t xml:space="preserve"> </w:t>
+      </w:r>
+      <w:r>
+        <w:rPr>
+          <w:rFonts w:hint="eastAsia" w:ascii="Times New Roman" w:hAnsi="Times New Roman" w:eastAsia="SimSun"/>
+          <w:b w:val="0"/>
+          <w:color w:val="000000"/>
+          <w:sz w:val="24"/>
+        </w:rPr>
+        <w:t xml:space="preserve">的稳定窗口。</w:t>
+      </w:r>
+    </w:p>
+    <w:p>
+      <w:pPr>
+        <w:pStyle w:val="BodyText"/>
         <w:spacing w:line="240" w:lineRule="auto" w:before="0" w:after="80"/>
         <w:ind w:firstLine="480"/>
       </w:pPr>
@@ -3629,7 +3460,25 @@
           <w:color w:val="000000"/>
           <w:sz w:val="24"/>
         </w:rPr>
-        <w:t xml:space="preserve">分离后形成一对共轭复极点；当</w:t>
+        <w:t xml:space="preserve">（2）若工程上要求“工作增益不超过稳定边界的</w:t>
+      </w:r>
+      <w:r>
+        <w:rPr>
+          <w:rFonts w:ascii="Times New Roman" w:hAnsi="Times New Roman" w:eastAsia="SimSun"/>
+          <w:b w:val="0"/>
+          <w:color w:val="000000"/>
+          <w:sz w:val="24"/>
+        </w:rPr>
+        <w:t xml:space="preserve"> </w:t>
+      </w:r>
+      <w:r>
+        <w:rPr>
+          <w:rFonts w:hint="eastAsia" w:ascii="Times New Roman" w:hAnsi="Times New Roman" w:eastAsia="SimSun"/>
+          <w:b w:val="0"/>
+          <w:color w:val="000000"/>
+          <w:sz w:val="24"/>
+        </w:rPr>
+        <w:t xml:space="preserve">80%”，求允许的</w:t>
       </w:r>
       <w:r>
         <w:rPr>
@@ -3649,19 +3498,10 @@
           </m:e>
           <m:sub>
             <m:r>
-              <m:t>r</m:t>
+              <m:t>c</m:t>
             </m:r>
           </m:sub>
         </m:sSub>
-        <m:r>
-          <m:rPr>
-            <m:sty m:val="p"/>
-          </m:rPr>
-          <m:t>=</m:t>
-        </m:r>
-        <m:r>
-          <m:t>6</m:t>
-        </m:r>
       </m:oMath>
       <w:r>
         <w:rPr>
@@ -3679,56 +3519,12 @@
           <w:color w:val="000000"/>
           <w:sz w:val="24"/>
         </w:rPr>
-        <w:t xml:space="preserve">时，这对极点穿过虚轴，交点约为</w:t>
-      </w:r>
-      <w:r>
-        <w:rPr>
-          <w:rFonts w:ascii="Times New Roman" w:hAnsi="Times New Roman" w:eastAsia="SimSun"/>
-          <w:b w:val="0"/>
-          <w:color w:val="000000"/>
-          <w:sz w:val="24"/>
-        </w:rPr>
-        <w:t xml:space="preserve"> </w:t>
-      </w:r>
-      <m:oMath>
-        <m:r>
-          <m:t>s</m:t>
-        </m:r>
-        <m:r>
-          <m:rPr>
-            <m:sty m:val="p"/>
-          </m:rPr>
-          <m:t>=</m:t>
-        </m:r>
-        <m:r>
-          <m:rPr>
-            <m:sty m:val="p"/>
-          </m:rPr>
-          <m:t>±</m:t>
-        </m:r>
-        <m:r>
-          <m:t>j</m:t>
-        </m:r>
-        <m:r>
-          <m:t>2.4</m:t>
-        </m:r>
-      </m:oMath>
-      <w:r>
-        <w:rPr>
-          <w:rFonts w:ascii="Times New Roman" w:hAnsi="Times New Roman" w:eastAsia="SimSun"/>
-          <w:b w:val="0"/>
-          <w:color w:val="000000"/>
-          <w:sz w:val="24"/>
-        </w:rPr>
-        <w:t xml:space="preserve">。</w:t>
-      </w:r>
-    </w:p>
-    <w:p>
-      <w:pPr>
-        <w:numPr>
-          <w:ilvl w:val="0"/>
-          <w:numId w:val="1001"/>
-        </w:numPr>
+        <w:t xml:space="preserve">上限。</w:t>
+      </w:r>
+    </w:p>
+    <w:p>
+      <w:pPr>
+        <w:pStyle w:val="BodyText"/>
         <w:spacing w:line="240" w:lineRule="auto" w:before="0" w:after="80"/>
         <w:ind w:firstLine="480"/>
       </w:pPr>
@@ -3739,7 +3535,7 @@
           <w:color w:val="000000"/>
           <w:sz w:val="24"/>
         </w:rPr>
-        <w:t xml:space="preserve">当</w:t>
+        <w:t xml:space="preserve">（3）现把控制器增益从</w:t>
       </w:r>
       <w:r>
         <w:rPr>
@@ -3759,7 +3555,7 @@
           </m:e>
           <m:sub>
             <m:r>
-              <m:t>r</m:t>
+              <m:t>c</m:t>
             </m:r>
           </m:sub>
         </m:sSub>
@@ -3767,10 +3563,10 @@
           <m:rPr>
             <m:sty m:val="p"/>
           </m:rPr>
-          <m:t>&gt;</m:t>
-        </m:r>
-        <m:r>
-          <m:t>6</m:t>
+          <m:t>=</m:t>
+        </m:r>
+        <m:r>
+          <m:t>0.50</m:t>
         </m:r>
       </m:oMath>
       <w:r>
@@ -3789,26 +3585,7 @@
           <w:color w:val="000000"/>
           <w:sz w:val="24"/>
         </w:rPr>
-        <w:t xml:space="preserve">时，这对共轭极点进入右半平面。</w:t>
-      </w:r>
-    </w:p>
-    <w:p>
-      <w:pPr>
-        <w:numPr>
-          <w:ilvl w:val="0"/>
-          <w:numId w:val="1001"/>
-        </w:numPr>
-        <w:spacing w:line="240" w:lineRule="auto" w:before="0" w:after="80"/>
-        <w:ind w:firstLine="480"/>
-      </w:pPr>
-      <w:r>
-        <w:rPr>
-          <w:rFonts w:hint="eastAsia" w:ascii="Times New Roman" w:hAnsi="Times New Roman" w:eastAsia="SimSun"/>
-          <w:b w:val="0"/>
-          <w:color w:val="000000"/>
-          <w:sz w:val="24"/>
-        </w:rPr>
-        <w:t xml:space="preserve">当</w:t>
+        <w:t xml:space="preserve">增大到</w:t>
       </w:r>
       <w:r>
         <w:rPr>
@@ -3828,7 +3605,7 @@
           </m:e>
           <m:sub>
             <m:r>
-              <m:t>r</m:t>
+              <m:t>c</m:t>
             </m:r>
           </m:sub>
         </m:sSub>
@@ -3839,76 +3616,17 @@
           <m:t>=</m:t>
         </m:r>
         <m:r>
-          <m:t>2</m:t>
+          <m:t>1.50</m:t>
         </m:r>
       </m:oMath>
       <w:r>
         <w:rPr>
-          <w:rFonts w:ascii="Times New Roman" w:hAnsi="Times New Roman" w:eastAsia="SimSun"/>
-          <w:b w:val="0"/>
-          <w:color w:val="000000"/>
-          <w:sz w:val="24"/>
-        </w:rPr>
-        <w:t xml:space="preserve"> </w:t>
-      </w:r>
-      <w:r>
-        <w:rPr>
-          <w:rFonts w:hint="eastAsia" w:ascii="Times New Roman" w:hAnsi="Times New Roman" w:eastAsia="SimSun"/>
-          <w:b w:val="0"/>
-          <w:color w:val="000000"/>
-          <w:sz w:val="24"/>
-        </w:rPr>
-        <w:t xml:space="preserve">时，主导极点约为</w:t>
-      </w:r>
-      <w:r>
-        <w:rPr>
-          <w:rFonts w:ascii="Times New Roman" w:hAnsi="Times New Roman" w:eastAsia="SimSun"/>
-          <w:b w:val="0"/>
-          <w:color w:val="000000"/>
-          <w:sz w:val="24"/>
-        </w:rPr>
-        <w:t xml:space="preserve"> </w:t>
-      </w:r>
-      <m:oMath>
-        <m:r>
-          <m:t>s</m:t>
-        </m:r>
-        <m:r>
-          <m:rPr>
-            <m:sty m:val="p"/>
-          </m:rPr>
-          <m:t>=</m:t>
-        </m:r>
-        <m:r>
-          <m:rPr>
-            <m:sty m:val="p"/>
-          </m:rPr>
-          <m:t>−</m:t>
-        </m:r>
-        <m:r>
-          <m:t>0.72</m:t>
-        </m:r>
-        <m:r>
-          <m:rPr>
-            <m:sty m:val="p"/>
-          </m:rPr>
-          <m:t>±</m:t>
-        </m:r>
-        <m:r>
-          <m:t>j</m:t>
-        </m:r>
-        <m:r>
-          <m:t>0.78</m:t>
-        </m:r>
-      </m:oMath>
-      <w:r>
-        <w:rPr>
-          <w:rFonts w:hint="eastAsia" w:ascii="Times New Roman" w:hAnsi="Times New Roman" w:eastAsia="SimSun"/>
-          <w:b w:val="0"/>
-          <w:color w:val="000000"/>
-          <w:sz w:val="24"/>
-        </w:rPr>
-        <w:t xml:space="preserve">；当</w:t>
+          <w:rFonts w:hint="eastAsia" w:ascii="Times New Roman" w:hAnsi="Times New Roman" w:eastAsia="SimSun"/>
+          <w:b w:val="0"/>
+          <w:color w:val="000000"/>
+          <w:sz w:val="24"/>
+        </w:rPr>
+        <w:t xml:space="preserve">。说明根轨迹上的极点总体向哪个方向迁移，并结合图中</w:t>
       </w:r>
       <w:r>
         <w:rPr>
@@ -3939,7 +3657,7 @@
           <m:t>=</m:t>
         </m:r>
         <m:r>
-          <m:t>5</m:t>
+          <m:t>2</m:t>
         </m:r>
       </m:oMath>
       <w:r>
@@ -3958,89 +3676,7 @@
           <w:color w:val="000000"/>
           <w:sz w:val="24"/>
         </w:rPr>
-        <w:t xml:space="preserve">时，主导极点约为</w:t>
-      </w:r>
-      <w:r>
-        <w:rPr>
-          <w:rFonts w:ascii="Times New Roman" w:hAnsi="Times New Roman" w:eastAsia="SimSun"/>
-          <w:b w:val="0"/>
-          <w:color w:val="000000"/>
-          <w:sz w:val="24"/>
-        </w:rPr>
-        <w:t xml:space="preserve"> </w:t>
-      </w:r>
-      <m:oMath>
-        <m:r>
-          <m:t>s</m:t>
-        </m:r>
-        <m:r>
-          <m:rPr>
-            <m:sty m:val="p"/>
-          </m:rPr>
-          <m:t>=</m:t>
-        </m:r>
-        <m:r>
-          <m:rPr>
-            <m:sty m:val="p"/>
-          </m:rPr>
-          <m:t>−</m:t>
-        </m:r>
-        <m:r>
-          <m:t>0.18</m:t>
-        </m:r>
-        <m:r>
-          <m:rPr>
-            <m:sty m:val="p"/>
-          </m:rPr>
-          <m:t>±</m:t>
-        </m:r>
-        <m:r>
-          <m:t>j</m:t>
-        </m:r>
-        <m:r>
-          <m:t>1.92</m:t>
-        </m:r>
-      </m:oMath>
-      <w:r>
-        <w:rPr>
-          <w:rFonts w:ascii="Times New Roman" w:hAnsi="Times New Roman" w:eastAsia="SimSun"/>
-          <w:b w:val="0"/>
-          <w:color w:val="000000"/>
-          <w:sz w:val="24"/>
-        </w:rPr>
-        <w:t xml:space="preserve">。</w:t>
-      </w:r>
-    </w:p>
-    <w:p>
-      <w:pPr>
-        <w:pStyle w:val="FirstParagraph"/>
-        <w:spacing w:line="240" w:lineRule="auto" w:before="0" w:after="80"/>
-        <w:ind w:firstLine="480"/>
-      </w:pPr>
-      <w:r>
-        <w:rPr>
-          <w:rFonts w:hint="eastAsia" w:ascii="Times New Roman" w:hAnsi="Times New Roman" w:eastAsia="SimSun"/>
-          <w:b w:val="0"/>
-          <w:color w:val="000000"/>
-          <w:sz w:val="24"/>
-        </w:rPr>
-        <w:t xml:space="preserve">请回答：</w:t>
-      </w:r>
-    </w:p>
-    <w:p>
-      <w:pPr>
-        <w:pStyle w:val="BodyText"/>
-        <w:spacing w:line="240" w:lineRule="auto" w:before="0" w:after="80"/>
-        <w:ind w:firstLine="480"/>
-      </w:pPr>
-      <w:r>
-        <w:rPr>
-          <w:rFonts w:hint="eastAsia" w:ascii="Times New Roman" w:hAnsi="Times New Roman" w:eastAsia="SimSun"/>
-          <w:b w:val="0"/>
-          <w:color w:val="000000"/>
-          <w:sz w:val="24"/>
-        </w:rPr>
-        <w:t xml:space="preserve">（1）写出闭环稳定的</w:t>
+        <w:t xml:space="preserve">与</w:t>
       </w:r>
       <w:r>
         <w:rPr>
@@ -4064,6 +3700,15 @@
             </m:r>
           </m:sub>
         </m:sSub>
+        <m:r>
+          <m:rPr>
+            <m:sty m:val="p"/>
+          </m:rPr>
+          <m:t>=</m:t>
+        </m:r>
+        <m:r>
+          <m:t>6</m:t>
+        </m:r>
       </m:oMath>
       <w:r>
         <w:rPr>
@@ -4081,230 +3726,7 @@
           <w:color w:val="000000"/>
           <w:sz w:val="24"/>
         </w:rPr>
-        <w:t xml:space="preserve">取值窗口，并换算为实际控制器增益</w:t>
-      </w:r>
-      <w:r>
-        <w:rPr>
-          <w:rFonts w:ascii="Times New Roman" w:hAnsi="Times New Roman" w:eastAsia="SimSun"/>
-          <w:b w:val="0"/>
-          <w:color w:val="000000"/>
-          <w:sz w:val="24"/>
-        </w:rPr>
-        <w:t xml:space="preserve"> </w:t>
-      </w:r>
-      <m:oMath>
-        <m:sSub>
-          <m:e>
-            <m:r>
-              <m:t>K</m:t>
-            </m:r>
-          </m:e>
-          <m:sub>
-            <m:r>
-              <m:t>c</m:t>
-            </m:r>
-          </m:sub>
-        </m:sSub>
-      </m:oMath>
-      <w:r>
-        <w:rPr>
-          <w:rFonts w:ascii="Times New Roman" w:hAnsi="Times New Roman" w:eastAsia="SimSun"/>
-          <w:b w:val="0"/>
-          <w:color w:val="000000"/>
-          <w:sz w:val="24"/>
-        </w:rPr>
-        <w:t xml:space="preserve"> </w:t>
-      </w:r>
-      <w:r>
-        <w:rPr>
-          <w:rFonts w:hint="eastAsia" w:ascii="Times New Roman" w:hAnsi="Times New Roman" w:eastAsia="SimSun"/>
-          <w:b w:val="0"/>
-          <w:color w:val="000000"/>
-          <w:sz w:val="24"/>
-        </w:rPr>
-        <w:t xml:space="preserve">的稳定窗口。</w:t>
-      </w:r>
-    </w:p>
-    <w:p>
-      <w:pPr>
-        <w:pStyle w:val="BodyText"/>
-        <w:spacing w:line="240" w:lineRule="auto" w:before="0" w:after="80"/>
-        <w:ind w:firstLine="480"/>
-      </w:pPr>
-      <w:r>
-        <w:rPr>
-          <w:rFonts w:hint="eastAsia" w:ascii="Times New Roman" w:hAnsi="Times New Roman" w:eastAsia="SimSun"/>
-          <w:b w:val="0"/>
-          <w:color w:val="000000"/>
-          <w:sz w:val="24"/>
-        </w:rPr>
-        <w:t xml:space="preserve">（2）若工程上要求“工作增益不超过稳定边界的</w:t>
-      </w:r>
-      <w:r>
-        <w:rPr>
-          <w:rFonts w:ascii="Times New Roman" w:hAnsi="Times New Roman" w:eastAsia="SimSun"/>
-          <w:b w:val="0"/>
-          <w:color w:val="000000"/>
-          <w:sz w:val="24"/>
-        </w:rPr>
-        <w:t xml:space="preserve"> </w:t>
-      </w:r>
-      <w:r>
-        <w:rPr>
-          <w:rFonts w:hint="eastAsia" w:ascii="Times New Roman" w:hAnsi="Times New Roman" w:eastAsia="SimSun"/>
-          <w:b w:val="0"/>
-          <w:color w:val="000000"/>
-          <w:sz w:val="24"/>
-        </w:rPr>
-        <w:t xml:space="preserve">80%”，求允许的</w:t>
-      </w:r>
-      <w:r>
-        <w:rPr>
-          <w:rFonts w:ascii="Times New Roman" w:hAnsi="Times New Roman" w:eastAsia="SimSun"/>
-          <w:b w:val="0"/>
-          <w:color w:val="000000"/>
-          <w:sz w:val="24"/>
-        </w:rPr>
-        <w:t xml:space="preserve"> </w:t>
-      </w:r>
-      <m:oMath>
-        <m:sSub>
-          <m:e>
-            <m:r>
-              <m:t>K</m:t>
-            </m:r>
-          </m:e>
-          <m:sub>
-            <m:r>
-              <m:t>c</m:t>
-            </m:r>
-          </m:sub>
-        </m:sSub>
-      </m:oMath>
-      <w:r>
-        <w:rPr>
-          <w:rFonts w:ascii="Times New Roman" w:hAnsi="Times New Roman" w:eastAsia="SimSun"/>
-          <w:b w:val="0"/>
-          <w:color w:val="000000"/>
-          <w:sz w:val="24"/>
-        </w:rPr>
-        <w:t xml:space="preserve"> </w:t>
-      </w:r>
-      <w:r>
-        <w:rPr>
-          <w:rFonts w:hint="eastAsia" w:ascii="Times New Roman" w:hAnsi="Times New Roman" w:eastAsia="SimSun"/>
-          <w:b w:val="0"/>
-          <w:color w:val="000000"/>
-          <w:sz w:val="24"/>
-        </w:rPr>
-        <w:t xml:space="preserve">上限。</w:t>
-      </w:r>
-    </w:p>
-    <w:p>
-      <w:pPr>
-        <w:pStyle w:val="BodyText"/>
-        <w:spacing w:line="240" w:lineRule="auto" w:before="0" w:after="80"/>
-        <w:ind w:firstLine="480"/>
-      </w:pPr>
-      <w:r>
-        <w:rPr>
-          <w:rFonts w:hint="eastAsia" w:ascii="Times New Roman" w:hAnsi="Times New Roman" w:eastAsia="SimSun"/>
-          <w:b w:val="0"/>
-          <w:color w:val="000000"/>
-          <w:sz w:val="24"/>
-        </w:rPr>
-        <w:t xml:space="preserve">（3）现把控制器增益从</w:t>
-      </w:r>
-      <w:r>
-        <w:rPr>
-          <w:rFonts w:ascii="Times New Roman" w:hAnsi="Times New Roman" w:eastAsia="SimSun"/>
-          <w:b w:val="0"/>
-          <w:color w:val="000000"/>
-          <w:sz w:val="24"/>
-        </w:rPr>
-        <w:t xml:space="preserve"> </w:t>
-      </w:r>
-      <m:oMath>
-        <m:sSub>
-          <m:e>
-            <m:r>
-              <m:t>K</m:t>
-            </m:r>
-          </m:e>
-          <m:sub>
-            <m:r>
-              <m:t>c</m:t>
-            </m:r>
-          </m:sub>
-        </m:sSub>
-        <m:r>
-          <m:rPr>
-            <m:sty m:val="p"/>
-          </m:rPr>
-          <m:t>=</m:t>
-        </m:r>
-        <m:r>
-          <m:t>0.50</m:t>
-        </m:r>
-      </m:oMath>
-      <w:r>
-        <w:rPr>
-          <w:rFonts w:ascii="Times New Roman" w:hAnsi="Times New Roman" w:eastAsia="SimSun"/>
-          <w:b w:val="0"/>
-          <w:color w:val="000000"/>
-          <w:sz w:val="24"/>
-        </w:rPr>
-        <w:t xml:space="preserve"> </w:t>
-      </w:r>
-      <w:r>
-        <w:rPr>
-          <w:rFonts w:hint="eastAsia" w:ascii="Times New Roman" w:hAnsi="Times New Roman" w:eastAsia="SimSun"/>
-          <w:b w:val="0"/>
-          <w:color w:val="000000"/>
-          <w:sz w:val="24"/>
-        </w:rPr>
-        <w:t xml:space="preserve">增大到</w:t>
-      </w:r>
-      <w:r>
-        <w:rPr>
-          <w:rFonts w:ascii="Times New Roman" w:hAnsi="Times New Roman" w:eastAsia="SimSun"/>
-          <w:b w:val="0"/>
-          <w:color w:val="000000"/>
-          <w:sz w:val="24"/>
-        </w:rPr>
-        <w:t xml:space="preserve"> </w:t>
-      </w:r>
-      <m:oMath>
-        <m:sSub>
-          <m:e>
-            <m:r>
-              <m:t>K</m:t>
-            </m:r>
-          </m:e>
-          <m:sub>
-            <m:r>
-              <m:t>c</m:t>
-            </m:r>
-          </m:sub>
-        </m:sSub>
-        <m:r>
-          <m:rPr>
-            <m:sty m:val="p"/>
-          </m:rPr>
-          <m:t>=</m:t>
-        </m:r>
-        <m:r>
-          <m:t>1.25</m:t>
-        </m:r>
-      </m:oMath>
-      <w:r>
-        <w:rPr>
-          <w:rFonts w:hint="eastAsia" w:ascii="Times New Roman" w:hAnsi="Times New Roman" w:eastAsia="SimSun"/>
-          <w:b w:val="0"/>
-          <w:color w:val="000000"/>
-          <w:sz w:val="24"/>
-        </w:rPr>
-        <w:t xml:space="preserve">。说明根轨迹上的极点总体向哪个方向迁移，并结合读点解释闭环响应在振荡程度、超调趋势和衰减快慢上的变化。</w:t>
+        <w:t xml:space="preserve">附近的读点解释闭环响应在振荡程度、超调趋势和衰减快慢上的变化。</w:t>
       </w:r>
     </w:p>
     <w:bookmarkEnd w:id="19"/>
@@ -6037,6 +5459,7 @@
       <w:footnotePr>
         <w:numRestart w:val="eachSect"/>
       </w:footnotePr>
+      <w:pgSz w:w="11906" w:h="16838"/>
       <w:pgMar w:top="720" w:bottom="720" w:left="720" w:right="720"/>
     </w:sectPr>
   </w:body>
@@ -6144,123 +5567,8 @@
       </w:pPr>
     </w:lvl>
   </w:abstractNum>
-  <w:abstractNum w:abstractNumId="99411">
-    <w:nsid w:val="00A99411"/>
-    <w:multiLevelType w:val="multilevel"/>
-    <w:lvl w:ilvl="0">
-      <w:start w:val="1"/>
-      <w:numFmt w:val="decimal"/>
-      <w:lvlText w:val="%1."/>
-      <w:lvlJc w:val="left"/>
-      <w:pPr>
-        <w:ind w:left="720" w:hanging="360"/>
-      </w:pPr>
-    </w:lvl>
-    <w:lvl w:ilvl="1">
-      <w:start w:val="1"/>
-      <w:numFmt w:val="decimal"/>
-      <w:lvlText w:val="%2."/>
-      <w:lvlJc w:val="left"/>
-      <w:pPr>
-        <w:ind w:left="1440" w:hanging="360"/>
-      </w:pPr>
-    </w:lvl>
-    <w:lvl w:ilvl="2">
-      <w:start w:val="1"/>
-      <w:numFmt w:val="decimal"/>
-      <w:lvlText w:val="%3."/>
-      <w:lvlJc w:val="left"/>
-      <w:pPr>
-        <w:ind w:left="2160" w:hanging="360"/>
-      </w:pPr>
-    </w:lvl>
-    <w:lvl w:ilvl="3">
-      <w:start w:val="1"/>
-      <w:numFmt w:val="decimal"/>
-      <w:lvlText w:val="%4."/>
-      <w:lvlJc w:val="left"/>
-      <w:pPr>
-        <w:ind w:left="2880" w:hanging="360"/>
-      </w:pPr>
-    </w:lvl>
-    <w:lvl w:ilvl="4">
-      <w:start w:val="1"/>
-      <w:numFmt w:val="decimal"/>
-      <w:lvlText w:val="%5."/>
-      <w:lvlJc w:val="left"/>
-      <w:pPr>
-        <w:ind w:left="3600" w:hanging="360"/>
-      </w:pPr>
-    </w:lvl>
-    <w:lvl w:ilvl="5">
-      <w:start w:val="1"/>
-      <w:numFmt w:val="decimal"/>
-      <w:lvlText w:val="%6."/>
-      <w:lvlJc w:val="left"/>
-      <w:pPr>
-        <w:ind w:left="4320" w:hanging="360"/>
-      </w:pPr>
-    </w:lvl>
-    <w:lvl w:ilvl="6">
-      <w:start w:val="1"/>
-      <w:numFmt w:val="decimal"/>
-      <w:lvlText w:val="%7."/>
-      <w:lvlJc w:val="left"/>
-      <w:pPr>
-        <w:ind w:left="5040" w:hanging="360"/>
-      </w:pPr>
-    </w:lvl>
-    <w:lvl w:ilvl="7">
-      <w:start w:val="1"/>
-      <w:numFmt w:val="decimal"/>
-      <w:lvlText w:val="%8."/>
-      <w:lvlJc w:val="left"/>
-      <w:pPr>
-        <w:ind w:left="5760" w:hanging="360"/>
-      </w:pPr>
-    </w:lvl>
-    <w:lvl w:ilvl="8">
-      <w:start w:val="1"/>
-      <w:numFmt w:val="decimal"/>
-      <w:lvlText w:val="%9."/>
-      <w:lvlJc w:val="left"/>
-      <w:pPr>
-        <w:ind w:left="6480" w:hanging="360"/>
-      </w:pPr>
-    </w:lvl>
-  </w:abstractNum>
   <w:num w:numId="1000">
     <w:abstractNumId w:val="990"/>
-  </w:num>
-  <w:num w:numId="1001">
-    <w:abstractNumId w:val="99411"/>
-    <w:lvlOverride w:ilvl="0">
-      <w:startOverride w:val="1"/>
-    </w:lvlOverride>
-    <w:lvlOverride w:ilvl="1">
-      <w:startOverride w:val="1"/>
-    </w:lvlOverride>
-    <w:lvlOverride w:ilvl="2">
-      <w:startOverride w:val="1"/>
-    </w:lvlOverride>
-    <w:lvlOverride w:ilvl="3">
-      <w:startOverride w:val="1"/>
-    </w:lvlOverride>
-    <w:lvlOverride w:ilvl="4">
-      <w:startOverride w:val="1"/>
-    </w:lvlOverride>
-    <w:lvlOverride w:ilvl="5">
-      <w:startOverride w:val="1"/>
-    </w:lvlOverride>
-    <w:lvlOverride w:ilvl="6">
-      <w:startOverride w:val="1"/>
-    </w:lvlOverride>
-    <w:lvlOverride w:ilvl="7">
-      <w:startOverride w:val="1"/>
-    </w:lvlOverride>
-    <w:lvlOverride w:ilvl="8">
-      <w:startOverride w:val="1"/>
-    </w:lvlOverride>
   </w:num>
 </w:numbering>
 </file>

</xml_diff>